<commit_message>
docs: restyle the one-page competition proposal
</commit_message>
<xml_diff>
--- a/docs/competition/MoonResilience项目申报书.docx
+++ b/docs/competition/MoonResilience项目申报书.docx
@@ -5,13 +5,13 @@
     <w:p>
       <w:pPr>
         <w:spacing w:after="20"/>
-        <w:jc w:val="center"/>
+        <w:jc w:val="left"/>
       </w:pPr>
       <w:r>
         <w:rPr>
           <w:rFonts w:ascii="Microsoft YaHei" w:hAnsi="Microsoft YaHei" w:eastAsia="微软雅黑"/>
           <w:b w:val="0"/>
-          <w:color w:val="2867A8"/>
+          <w:color w:val="A77A35"/>
           <w:sz w:val="16"/>
         </w:rPr>
         <w:t>2026 MoonBit 国产基础软件开源大赛</w:t>
@@ -20,13 +20,13 @@
     <w:p>
       <w:pPr>
         <w:spacing w:after="0"/>
-        <w:jc w:val="center"/>
+        <w:jc w:val="left"/>
       </w:pPr>
       <w:r>
         <w:rPr>
           <w:rFonts w:ascii="Microsoft YaHei" w:hAnsi="Microsoft YaHei" w:eastAsia="微软雅黑"/>
           <w:b/>
-          <w:color w:val="183153"/>
+          <w:color w:val="214E3B"/>
           <w:sz w:val="40"/>
         </w:rPr>
         <w:t>MoonResilience 项目申报书</w:t>
@@ -35,7 +35,7 @@
     <w:p>
       <w:pPr>
         <w:spacing w:after="100"/>
-        <w:jc w:val="center"/>
+        <w:jc w:val="left"/>
       </w:pPr>
       <w:r>
         <w:rPr>
@@ -68,14 +68,14 @@
               <w:bottom w:w="45" w:type="dxa"/>
               <w:end w:w="90" w:type="dxa"/>
             </w:tcMar>
-            <w:shd w:fill="EDF3F9"/>
+            <w:shd w:fill="F5F0E7"/>
           </w:tcPr>
           <w:p>
             <w:r>
               <w:rPr>
                 <w:rFonts w:ascii="Microsoft YaHei" w:hAnsi="Microsoft YaHei" w:eastAsia="微软雅黑"/>
                 <w:b/>
-                <w:color w:val="183153"/>
+                <w:color w:val="214E3B"/>
                 <w:sz w:val="16"/>
               </w:rPr>
               <w:t>项目名称</w:t>
@@ -117,14 +117,14 @@
               <w:bottom w:w="45" w:type="dxa"/>
               <w:end w:w="90" w:type="dxa"/>
             </w:tcMar>
-            <w:shd w:fill="EDF3F9"/>
+            <w:shd w:fill="F5F0E7"/>
           </w:tcPr>
           <w:p>
             <w:r>
               <w:rPr>
                 <w:rFonts w:ascii="Microsoft YaHei" w:hAnsi="Microsoft YaHei" w:eastAsia="微软雅黑"/>
                 <w:b/>
-                <w:color w:val="183153"/>
+                <w:color w:val="214E3B"/>
                 <w:sz w:val="16"/>
               </w:rPr>
               <w:t>参赛方向</w:t>
@@ -166,14 +166,14 @@
               <w:bottom w:w="45" w:type="dxa"/>
               <w:end w:w="90" w:type="dxa"/>
             </w:tcMar>
-            <w:shd w:fill="EDF3F9"/>
+            <w:shd w:fill="F5F0E7"/>
           </w:tcPr>
           <w:p>
             <w:r>
               <w:rPr>
                 <w:rFonts w:ascii="Microsoft YaHei" w:hAnsi="Microsoft YaHei" w:eastAsia="微软雅黑"/>
                 <w:b/>
-                <w:color w:val="183153"/>
+                <w:color w:val="214E3B"/>
                 <w:sz w:val="16"/>
               </w:rPr>
               <w:t>开源许可证</w:t>
@@ -215,14 +215,14 @@
               <w:bottom w:w="45" w:type="dxa"/>
               <w:end w:w="90" w:type="dxa"/>
             </w:tcMar>
-            <w:shd w:fill="EDF3F9"/>
+            <w:shd w:fill="F5F0E7"/>
           </w:tcPr>
           <w:p>
             <w:r>
               <w:rPr>
                 <w:rFonts w:ascii="Microsoft YaHei" w:hAnsi="Microsoft YaHei" w:eastAsia="微软雅黑"/>
                 <w:b/>
-                <w:color w:val="183153"/>
+                <w:color w:val="214E3B"/>
                 <w:sz w:val="16"/>
               </w:rPr>
               <w:t>GitLink 仓库</w:t>
@@ -264,14 +264,14 @@
               <w:bottom w:w="45" w:type="dxa"/>
               <w:end w:w="90" w:type="dxa"/>
             </w:tcMar>
-            <w:shd w:fill="EDF3F9"/>
+            <w:shd w:fill="F5F0E7"/>
           </w:tcPr>
           <w:p>
             <w:r>
               <w:rPr>
                 <w:rFonts w:ascii="Microsoft YaHei" w:hAnsi="Microsoft YaHei" w:eastAsia="微软雅黑"/>
                 <w:b/>
-                <w:color w:val="183153"/>
+                <w:color w:val="214E3B"/>
                 <w:sz w:val="16"/>
               </w:rPr>
               <w:t>GitHub 仓库</w:t>
@@ -317,7 +317,7 @@
         <w:rPr>
           <w:rFonts w:ascii="Microsoft YaHei" w:hAnsi="Microsoft YaHei" w:eastAsia="微软雅黑"/>
           <w:b/>
-          <w:color w:val="183153"/>
+          <w:color w:val="214E3B"/>
           <w:sz w:val="18"/>
         </w:rPr>
         <w:t>01  项目目标与适用对象</w:t>
@@ -347,7 +347,7 @@
         <w:rPr>
           <w:rFonts w:ascii="Microsoft YaHei" w:hAnsi="Microsoft YaHei" w:eastAsia="微软雅黑"/>
           <w:b/>
-          <w:color w:val="183153"/>
+          <w:color w:val="214E3B"/>
           <w:sz w:val="18"/>
         </w:rPr>
         <w:t>02  项目方案与核心能力</w:t>
@@ -377,7 +377,7 @@
         <w:rPr>
           <w:rFonts w:ascii="Microsoft YaHei" w:hAnsi="Microsoft YaHei" w:eastAsia="微软雅黑"/>
           <w:b/>
-          <w:color w:val="183153"/>
+          <w:color w:val="214E3B"/>
           <w:sz w:val="18"/>
         </w:rPr>
         <w:t>03  技术路线</w:t>
@@ -407,7 +407,7 @@
         <w:rPr>
           <w:rFonts w:ascii="Microsoft YaHei" w:hAnsi="Microsoft YaHei" w:eastAsia="微软雅黑"/>
           <w:b/>
-          <w:color w:val="183153"/>
+          <w:color w:val="214E3B"/>
           <w:sz w:val="18"/>
         </w:rPr>
         <w:t>04  当前成果与验证方式</w:t>
@@ -425,7 +425,7 @@
           <w:color w:val="17212B"/>
           <w:sz w:val="17"/>
         </w:rPr>
-        <w:t>仓库已完成核心库、CLI 示例、配置样例、API 与架构文档，现有约 4.5k 行有效 MoonBit 代码和 100 项测试。测试覆盖退避边界、熔断状态转换、两类限流器、Bulkhead 容量耗尽、策略顺序、配置错误、时间模拟、指标导出及批量场景。评审者可直接运行 moon check、moon test 和 moon run cmd/main；README 同时列出同步执行、显式时钟等当前边界。</w:t>
+        <w:t>仓库已完成核心库、CLI 示例、配置样例、API 与架构文档，现有约 5.0k 行有效 MoonBit 代码和 100 项测试。测试覆盖退避边界、熔断状态转换、两类限流器、Bulkhead 容量耗尽、策略顺序、配置错误、时间模拟、指标导出及批量场景。评审者可直接运行 moon check、moon test 和 moon run cmd/main；README 同时列出同步执行、显式时钟等当前边界。</w:t>
       </w:r>
     </w:p>
     <w:p>
@@ -437,7 +437,7 @@
         <w:rPr>
           <w:rFonts w:ascii="Microsoft YaHei" w:hAnsi="Microsoft YaHei" w:eastAsia="微软雅黑"/>
           <w:b/>
-          <w:color w:val="183153"/>
+          <w:color w:val="214E3B"/>
           <w:sz w:val="18"/>
         </w:rPr>
         <w:t>05  公开开发与后续计划</w:t>
@@ -473,7 +473,7 @@
         <w:tc>
           <w:tcPr>
             <w:tcW w:type="dxa" w:w="2579"/>
-            <w:shd w:fill="EDF3F9"/>
+            <w:shd w:fill="F5F0E7"/>
             <w:tcMar>
               <w:top w:w="70" w:type="dxa"/>
               <w:start w:w="90" w:type="dxa"/>
@@ -490,7 +490,7 @@
               <w:rPr>
                 <w:rFonts w:ascii="Microsoft YaHei" w:hAnsi="Microsoft YaHei" w:eastAsia="微软雅黑"/>
                 <w:b/>
-                <w:color w:val="183153"/>
+                <w:color w:val="214E3B"/>
                 <w:sz w:val="18"/>
               </w:rPr>
               <w:t>4 类</w:t>
@@ -510,7 +510,7 @@
         <w:tc>
           <w:tcPr>
             <w:tcW w:type="dxa" w:w="2579"/>
-            <w:shd w:fill="EDF3F9"/>
+            <w:shd w:fill="F5F0E7"/>
             <w:tcMar>
               <w:top w:w="70" w:type="dxa"/>
               <w:start w:w="90" w:type="dxa"/>
@@ -527,7 +527,7 @@
               <w:rPr>
                 <w:rFonts w:ascii="Microsoft YaHei" w:hAnsi="Microsoft YaHei" w:eastAsia="微软雅黑"/>
                 <w:b/>
-                <w:color w:val="183153"/>
+                <w:color w:val="214E3B"/>
                 <w:sz w:val="18"/>
               </w:rPr>
               <w:t>2 种</w:t>
@@ -547,7 +547,7 @@
         <w:tc>
           <w:tcPr>
             <w:tcW w:type="dxa" w:w="2579"/>
-            <w:shd w:fill="EDF3F9"/>
+            <w:shd w:fill="F5F0E7"/>
             <w:tcMar>
               <w:top w:w="70" w:type="dxa"/>
               <w:start w:w="90" w:type="dxa"/>
@@ -564,10 +564,10 @@
               <w:rPr>
                 <w:rFonts w:ascii="Microsoft YaHei" w:hAnsi="Microsoft YaHei" w:eastAsia="微软雅黑"/>
                 <w:b/>
-                <w:color w:val="183153"/>
+                <w:color w:val="214E3B"/>
                 <w:sz w:val="18"/>
               </w:rPr>
-              <w:t>约 4.5k 行</w:t>
+              <w:t>约 5.0k 行</w:t>
               <w:br/>
             </w:r>
             <w:r>
@@ -584,7 +584,7 @@
         <w:tc>
           <w:tcPr>
             <w:tcW w:type="dxa" w:w="2579"/>
-            <w:shd w:fill="EDF3F9"/>
+            <w:shd w:fill="F5F0E7"/>
             <w:tcMar>
               <w:top w:w="70" w:type="dxa"/>
               <w:start w:w="90" w:type="dxa"/>
@@ -601,7 +601,7 @@
               <w:rPr>
                 <w:rFonts w:ascii="Microsoft YaHei" w:hAnsi="Microsoft YaHei" w:eastAsia="微软雅黑"/>
                 <w:b/>
-                <w:color w:val="183153"/>
+                <w:color w:val="214E3B"/>
                 <w:sz w:val="18"/>
               </w:rPr>
               <w:t>100 项</w:t>

</xml_diff>

<commit_message>
docs: synchronize acceptance materials
</commit_message>
<xml_diff>
--- a/docs/competition/MoonResilience项目申报书.docx
+++ b/docs/competition/MoonResilience项目申报书.docx
@@ -425,7 +425,7 @@
           <w:color w:val="17212B"/>
           <w:sz w:val="17"/>
         </w:rPr>
-        <w:t>仓库已完成核心库、CLI 示例、配置样例、API 与架构文档，现有约 5.0k 行有效 MoonBit 代码和 100 项测试。测试覆盖退避边界、熔断状态转换、两类限流器、Bulkhead 容量耗尽、策略顺序、配置错误、时间模拟、指标导出及批量场景。评审者可直接运行 moon check、moon test 和 moon run cmd/main；README 同时列出同步执行、显式时钟等当前边界。</w:t>
+        <w:t>仓库已完成核心库、CLI 示例、配置样例、API 与架构文档，现有约 5.0k 行有效 MoonBit 代码和 110 项测试。测试覆盖退避边界、熔断状态转换、两类限流器、Bulkhead 容量耗尽、策略顺序、配置错误、时间模拟、指标导出及批量场景。评审者可直接运行 moon check、moon test、moon build 和 moon run cmd/main；README 同时列出同步执行、显式时钟等当前边界。</w:t>
       </w:r>
     </w:p>
     <w:p>
@@ -604,7 +604,7 @@
                 <w:color w:val="214E3B"/>
                 <w:sz w:val="18"/>
               </w:rPr>
-              <w:t>100 项</w:t>
+              <w:t>110 项</w:t>
               <w:br/>
             </w:r>
             <w:r>

</xml_diff>